<commit_message>
auto(daily): dev loop report 2026-06-22
</commit_message>
<xml_diff>
--- a/reports/hypothesis/2026-06-22.docx
+++ b/reports/hypothesis/2026-06-22.docx
@@ -15,7 +15,7 @@
         <w:rPr>
           <w:i/>
         </w:rPr>
-        <w:t>생성일: 2026-06-22 09:15 KST  |  표본: 측정소당 최소 2676건 / 총 13555건</w:t>
+        <w:t>생성일: 2026-06-22 14:28 KST  |  표본: 측정소당 최소 2682건 / 총 13585건</w:t>
       </w:r>
     </w:p>
     <w:p>
@@ -143,7 +143,7 @@
           </w:tcPr>
           <w:p>
             <w:r>
-              <w:t>35.477</w:t>
+              <w:t>35.439</w:t>
             </w:r>
           </w:p>
         </w:tc>
@@ -153,7 +153,7 @@
           </w:tcPr>
           <w:p>
             <w:r>
-              <w:t>32.620</w:t>
+              <w:t>32.602</w:t>
             </w:r>
           </w:p>
         </w:tc>
@@ -163,7 +163,7 @@
           </w:tcPr>
           <w:p>
             <w:r>
-              <w:t>+2.857</w:t>
+              <w:t>+2.837</w:t>
             </w:r>
           </w:p>
         </w:tc>
@@ -193,7 +193,7 @@
           </w:tcPr>
           <w:p>
             <w:r>
-              <w:t>+0.13 (미미함)</w:t>
+              <w:t>+0.12 (미미함)</w:t>
             </w:r>
           </w:p>
         </w:tc>
@@ -215,7 +215,7 @@
           </w:tcPr>
           <w:p>
             <w:r>
-              <w:t>20.003</w:t>
+              <w:t>19.978</w:t>
             </w:r>
           </w:p>
         </w:tc>
@@ -225,7 +225,7 @@
           </w:tcPr>
           <w:p>
             <w:r>
-              <w:t>17.295</w:t>
+              <w:t>17.287</w:t>
             </w:r>
           </w:p>
         </w:tc>
@@ -235,7 +235,7 @@
           </w:tcPr>
           <w:p>
             <w:r>
-              <w:t>+2.708</w:t>
+              <w:t>+2.691</w:t>
             </w:r>
           </w:p>
         </w:tc>
@@ -660,7 +660,7 @@
           </w:tcPr>
           <w:p>
             <w:r>
-              <w:t>30.86</w:t>
+              <w:t>30.78</w:t>
             </w:r>
           </w:p>
         </w:tc>
@@ -722,7 +722,7 @@
           </w:tcPr>
           <w:p>
             <w:r>
-              <w:t>82.21</w:t>
+              <w:t>82.11</w:t>
             </w:r>
           </w:p>
         </w:tc>
@@ -784,7 +784,7 @@
           </w:tcPr>
           <w:p>
             <w:r>
-              <w:t>14.81</w:t>
+              <w:t>14.77</w:t>
             </w:r>
           </w:p>
         </w:tc>
@@ -846,7 +846,7 @@
           </w:tcPr>
           <w:p>
             <w:r>
-              <w:t>163.13</w:t>
+              <w:t>163.09</w:t>
             </w:r>
           </w:p>
         </w:tc>
@@ -908,7 +908,7 @@
           </w:tcPr>
           <w:p>
             <w:r>
-              <w:t>70.21</w:t>
+              <w:t>70.42</w:t>
             </w:r>
           </w:p>
         </w:tc>
@@ -970,7 +970,7 @@
           </w:tcPr>
           <w:p>
             <w:r>
-              <w:t>172.36</w:t>
+              <w:t>173.35</w:t>
             </w:r>
           </w:p>
         </w:tc>
@@ -1029,7 +1029,7 @@
         <w:pStyle w:val="ListBullet"/>
       </w:pPr>
       <w:r>
-        <w:t>'산단 영향군'가 '베이스라인'보다 평균 2.71 높음 (p=0.0000, 효과크기 작음 d=0.21).</w:t>
+        <w:t>'산단 영향군'가 '베이스라인'보다 평균 2.69 높음 (p=0.0000, 효과크기 작음 d=0.21).</w:t>
       </w:r>
     </w:p>
     <w:p>

</xml_diff>